<commit_message>
Dokumentation bereinigt, Dashboard-Fixes, Praesentation auf 35 Folien verdichtet
- Alle Erwaehnungen der frueher falsch interpretierten QSErgBewStrukDialog-Codes
  durchgehend aus README, ProjektDetails, ToDo, allen Doku/MD-Dateien, Notebooks
  und Generator-Skripten entfernt
- Doku/Dozent/ (Zwischenpraesentation fuer die Dozenten) entfernt, Referenzen bereinigt
- Dashboard: px.scatter_map statt veraltetem scatter_mapbox, use_container_width
  auf width="stretch" migriert, Bundesland-Vergleich als Kachelkarte
- Aufgabenstellung/Fragestellung.docx und .md gezielt eingecheckt (uebrige Dateien
  im Ordner, u. a. die Kickoff-Aufzeichnung, bleiben per .gitignore ausgeschlossen)
- Projektbegleitende_Praesentation.pptx von 43 auf 35 Folien verdichtet (8 Folienpaare
  zusammengelegt inkl. neuer Sprechernotizen), Dashboard-Screenshots aktualisiert

Co-Authored-By: Claude Sonnet 5 <noreply@anthropic.com>
</commit_message>
<xml_diff>
--- a/Doku/Word/Dashboard_Uebersicht.docx
+++ b/Doku/Word/Dashboard_Uebersicht.docx
@@ -4,25 +4,16 @@
   <w:body>
     <w:p>
       <w:pPr>
-        <w:pStyle w:val="Title"/>
-        <w:jc w:val="center"/>
-      </w:pPr>
-      <w:r>
-        <w:t>Dashboard — Qualitätsprobleme</w:t>
-        <w:br/>
-        <w:t>deutscher Krankenhäuser</w:t>
-      </w:r>
-    </w:p>
-    <w:p>
-      <w:pPr>
+        <w:spacing w:before="600"/>
         <w:jc w:val="center"/>
       </w:pPr>
       <w:r>
         <w:rPr>
-          <w:i/>
-          <w:sz w:val="24"/>
+          <w:b/>
+          <w:color w:val="1F497D"/>
+          <w:sz w:val="40"/>
         </w:rPr>
-        <w:t>Was das Dashboard zeigt und wie man es benutzt</w:t>
+        <w:t>Dashboard — Qualitätsprobleme deutscher Krankenhäuser</w:t>
       </w:r>
     </w:p>
     <w:p>
@@ -32,105 +23,117 @@
       <w:r>
         <w:rPr>
           <w:color w:val="555555"/>
-          <w:sz w:val="20"/>
+          <w:sz w:val="28"/>
         </w:rPr>
-        <w:t>Projekt: Qualitäts-Muster-Finder  |  Datenbasis: 1.824 Krankenhäuser, IQTIG 2023</w:t>
+        <w:t>Was das Dashboard zeigt und wie man es benutzt</w:t>
       </w:r>
     </w:p>
+    <w:p/>
     <w:p>
+      <w:pPr>
+        <w:jc w:val="center"/>
+      </w:pPr>
       <w:r>
-        <w:br w:type="page"/>
+        <w:rPr>
+          <w:color w:val="555555"/>
+          <w:sz w:val="22"/>
+        </w:rPr>
+        <w:t>Projekt: Qualitäts-Muster-Finder  |  Datenbasis: 1.821 Krankenhäuser, IQTIG 2023</w:t>
+      </w:r>
+    </w:p>
+    <w:p/>
+    <w:p>
+      <w:pPr>
+        <w:pStyle w:val="Heading1"/>
+        <w:spacing w:before="280" w:after="80"/>
+      </w:pPr>
+      <w:r>
+        <w:rPr>
+          <w:b/>
+          <w:color w:val="1F497D"/>
+          <w:sz w:val="28"/>
+        </w:rPr>
+        <w:t>Was ist das Dashboard?</w:t>
       </w:r>
     </w:p>
     <w:p>
       <w:pPr>
-        <w:pStyle w:val="Heading1"/>
+        <w:spacing w:before="0" w:after="120"/>
       </w:pPr>
-      <w:r>
-        <w:t>Was ist das Dashboard?</w:t>
-      </w:r>
-    </w:p>
-    <w:p>
       <w:r>
         <w:rPr>
           <w:b w:val="0"/>
+          <w:i w:val="0"/>
           <w:sz w:val="22"/>
         </w:rPr>
         <w:t>Das Dashboard macht die Ergebnisse unserer Datenanalyse interaktiv erkundbar. Es beantwortet die zentrale Projektfrage: Welche Strukturmerkmale eines Krankenhauses hängen damit zusammen, dass es überdurchschnittlich viele Qualitätsprobleme hat? Die Navigation befindet sich im blauen Header-Bereich — vier Seiten, zwischen denen man per Klick wechselt.</w:t>
       </w:r>
     </w:p>
-    <w:p/>
     <w:p>
+      <w:pPr>
+        <w:spacing w:before="80" w:after="80"/>
+        <w:pBdr>
+          <w:bottom w:val="single" w:sz="4" w:space="1" w:color="CCCCCC"/>
+        </w:pBdr>
+      </w:pPr>
+    </w:p>
+    <w:p>
+      <w:pPr>
+        <w:pStyle w:val="Heading1"/>
+        <w:spacing w:before="280" w:after="80"/>
+      </w:pPr>
       <w:r>
-        <w:br w:type="page"/>
+        <w:rPr>
+          <w:b/>
+          <w:color w:val="1F497D"/>
+          <w:sz w:val="28"/>
+        </w:rPr>
+        <w:t>Seite 1 — Gesamtüberblick</w:t>
       </w:r>
     </w:p>
     <w:p>
       <w:pPr>
-        <w:spacing w:before="80" w:after="40"/>
-        <w:shd w:val="clear" w:color="auto" w:fill="1A5376"/>
+        <w:spacing w:before="0" w:after="120"/>
       </w:pPr>
       <w:r>
         <w:rPr>
-          <w:b/>
-          <w:color w:val="FFFFFF"/>
-          <w:sz w:val="26"/>
-        </w:rPr>
-        <w:t xml:space="preserve">  Seite 1 — Gesamtüberblick  </w:t>
-      </w:r>
-    </w:p>
-    <w:p>
-      <w:pPr>
-        <w:spacing w:before="0"/>
-      </w:pPr>
-      <w:r>
-        <w:rPr>
-          <w:i/>
-          <w:sz w:val="21"/>
-        </w:rPr>
-        <w:t>Schneller Überblick über alle 1.824 Krankenhäuser</w:t>
-      </w:r>
-    </w:p>
-    <w:p/>
-    <w:p>
-      <w:r>
-        <w:rPr>
           <w:b w:val="0"/>
+          <w:i w:val="0"/>
           <w:sz w:val="22"/>
         </w:rPr>
-        <w:t>Die Startseite zeigt den vollständigen Datensatz auf einen Blick. Oben auf der Seite kann nach Bundesland, Trägerschaft und Klinik-Typ gefiltert werden — alle Grafiken reagieren sofort.</w:t>
+        <w:t>Schneller Überblick über alle 1.821 Krankenhäuser. Die Startseite zeigt den vollständigen Datensatz auf einen Blick. Oben auf der Seite kann nach Bundesland, Trägerschaft und Klinik-Typ gefiltert werden — alle Grafiken reagieren sofort.</w:t>
       </w:r>
     </w:p>
     <w:p>
       <w:pPr>
         <w:pStyle w:val="ListBullet"/>
+        <w:spacing w:before="0" w:after="80"/>
       </w:pPr>
       <w:r>
         <w:rPr>
           <w:b/>
-          <w:color w:val="1A5376"/>
           <w:sz w:val="22"/>
         </w:rPr>
-        <w:t xml:space="preserve">Kennzahlen-Tabelle:  </w:t>
+        <w:t xml:space="preserve">Kennzahlen-Tabelle: </w:t>
       </w:r>
       <w:r>
         <w:rPr>
           <w:sz w:val="22"/>
         </w:rPr>
-        <w:t>Anzahl Häuser, Anteil mit vielen Qualitätsproblemen, Ø auffällig-Quote, Ø Ärzte pro Bett</w:t>
+        <w:t>Anzahl Häuser, Anteil mit vielen Qualitätsproblemen, Ø auffällig-Quote, Ø Ärzte pro Bett.</w:t>
       </w:r>
     </w:p>
     <w:p>
       <w:pPr>
         <w:pStyle w:val="ListBullet"/>
+        <w:spacing w:before="0" w:after="80"/>
       </w:pPr>
       <w:r>
         <w:rPr>
           <w:b/>
-          <w:color w:val="1A5376"/>
           <w:sz w:val="22"/>
         </w:rPr>
-        <w:t xml:space="preserve">Deutschlandkarte:  </w:t>
+        <w:t xml:space="preserve">Deutschlandkarte: </w:t>
       </w:r>
       <w:r>
         <w:rPr>
@@ -142,153 +145,106 @@
     <w:p>
       <w:pPr>
         <w:pStyle w:val="ListBullet"/>
+        <w:spacing w:before="0" w:after="80"/>
       </w:pPr>
       <w:r>
         <w:rPr>
           <w:b/>
-          <w:color w:val="1A5376"/>
           <w:sz w:val="22"/>
         </w:rPr>
-        <w:t xml:space="preserve">Histogramm:  </w:t>
+        <w:t xml:space="preserve">Histogramm: </w:t>
       </w:r>
       <w:r>
         <w:rPr>
           <w:sz w:val="22"/>
         </w:rPr>
-        <w:t>Verteilung der Auffälligkeitsquote aller Häuser, gestrichelte Linie bei Median (~77 %)</w:t>
+        <w:t>Verteilung der Auffälligkeitsquote aller Häuser, gestrichelte Linie beim Median (5,88 %).</w:t>
       </w:r>
     </w:p>
     <w:p>
       <w:pPr>
         <w:pStyle w:val="ListBullet"/>
+        <w:spacing w:before="0" w:after="80"/>
       </w:pPr>
       <w:r>
         <w:rPr>
           <w:b/>
-          <w:color w:val="1A5376"/>
           <w:sz w:val="22"/>
         </w:rPr>
-        <w:t xml:space="preserve">Bundesland-Vergleich:  </w:t>
+        <w:t xml:space="preserve">Bundesland-Kachelkarte: </w:t>
       </w:r>
       <w:r>
         <w:rPr>
           <w:sz w:val="22"/>
         </w:rPr>
-        <w:t>Anteil Häuser mit vielen Problemen je Bundesland — wird ausgeblendet, wenn ein Bundesland-Filter aktiv ist</w:t>
-      </w:r>
-    </w:p>
-    <w:p/>
-    <w:p>
-      <w:pPr>
-        <w:jc w:val="center"/>
-      </w:pPr>
-      <w:r>
-        <w:drawing>
-          <wp:inline xmlns:a="http://schemas.openxmlformats.org/drawingml/2006/main" xmlns:pic="http://schemas.openxmlformats.org/drawingml/2006/picture">
-            <wp:extent cx="5486400" cy="3086100"/>
-            <wp:docPr id="1" name="Picture 1"/>
-            <wp:cNvGraphicFramePr>
-              <a:graphicFrameLocks noChangeAspect="1"/>
-            </wp:cNvGraphicFramePr>
-            <a:graphic>
-              <a:graphicData uri="http://schemas.openxmlformats.org/drawingml/2006/picture">
-                <pic:pic>
-                  <pic:nvPicPr>
-                    <pic:cNvPr id="0" name="gesamtuberblick.png"/>
-                    <pic:cNvPicPr/>
-                  </pic:nvPicPr>
-                  <pic:blipFill>
-                    <a:blip r:embed="rId9"/>
-                    <a:stretch>
-                      <a:fillRect/>
-                    </a:stretch>
-                  </pic:blipFill>
-                  <pic:spPr>
-                    <a:xfrm>
-                      <a:off x="0" y="0"/>
-                      <a:ext cx="5486400" cy="3086100"/>
-                    </a:xfrm>
-                    <a:prstGeom prst="rect"/>
-                  </pic:spPr>
-                </pic:pic>
-              </a:graphicData>
-            </a:graphic>
-          </wp:inline>
-        </w:drawing>
-      </w:r>
-    </w:p>
-    <w:p/>
-    <w:p>
-      <w:r>
-        <w:br w:type="page"/>
+        <w:t>Schematische Deutschlandkarte, eine Kachel pro Bundesland, Farbe von Grün (wenige) über Weiß bis Rot (viele Probleme) — wird ausgeblendet, wenn ein Bundesland-Filter aktiv ist.</w:t>
       </w:r>
     </w:p>
     <w:p>
       <w:pPr>
-        <w:spacing w:before="80" w:after="40"/>
-        <w:shd w:val="clear" w:color="auto" w:fill="1A5376"/>
+        <w:spacing w:before="80" w:after="80"/>
+        <w:pBdr>
+          <w:bottom w:val="single" w:sz="4" w:space="1" w:color="CCCCCC"/>
+        </w:pBdr>
+      </w:pPr>
+    </w:p>
+    <w:p>
+      <w:pPr>
+        <w:pStyle w:val="Heading1"/>
+        <w:spacing w:before="280" w:after="80"/>
       </w:pPr>
       <w:r>
         <w:rPr>
           <w:b/>
-          <w:color w:val="FFFFFF"/>
-          <w:sz w:val="26"/>
+          <w:color w:val="1F497D"/>
+          <w:sz w:val="28"/>
         </w:rPr>
-        <w:t xml:space="preserve">  Seite 2 — Einflussfaktoren  </w:t>
+        <w:t>Seite 2 — Einflussfaktoren</w:t>
       </w:r>
     </w:p>
     <w:p>
       <w:pPr>
-        <w:spacing w:before="0"/>
+        <w:spacing w:before="0" w:after="120"/>
       </w:pPr>
       <w:r>
         <w:rPr>
-          <w:i/>
-          <w:sz w:val="21"/>
-        </w:rPr>
-        <w:t>Welche Merkmale machen den Unterschied?</w:t>
-      </w:r>
-    </w:p>
-    <w:p/>
-    <w:p>
-      <w:r>
-        <w:rPr>
           <w:b w:val="0"/>
+          <w:i w:val="0"/>
           <w:sz w:val="22"/>
         </w:rPr>
-        <w:t>Diese Seite zeigt immer den vollständigen Datensatz (kein Filter). Vier Tabs beantworten jeweils eine eigene Frage:</w:t>
+        <w:t>Welche Merkmale machen den Unterschied? Diese Seite zeigt immer den vollständigen Datensatz (kein Filter). Vier Tabs beantworten jeweils eine eigene Frage:</w:t>
       </w:r>
     </w:p>
     <w:p>
       <w:pPr>
         <w:pStyle w:val="ListBullet"/>
+        <w:spacing w:before="0" w:after="80"/>
       </w:pPr>
       <w:r>
         <w:rPr>
           <w:b/>
-          <w:color w:val="1A5376"/>
           <w:sz w:val="22"/>
         </w:rPr>
-        <w:t xml:space="preserve">Trägerschaft:  </w:t>
+        <w:t xml:space="preserve">Trägerschaft: </w:t>
       </w:r>
       <w:r>
         <w:rPr>
           <w:sz w:val="22"/>
         </w:rPr>
-        <w:t>Unterscheiden sich private, öffentliche und freigemeinnützige Häuser in ihrer Auffälligkeitsquote? Statistische Auswertung: ANOVA p &lt; 0,001.</w:t>
+        <w:t>Unterscheiden sich private, öffentliche und freigemeinnützige Häuser in ihrer Auffälligkeitsquote? Statistische Auswertung: ANOVA, kein signifikanter Zusammenhang (p = 0,969).</w:t>
       </w:r>
     </w:p>
     <w:p>
       <w:pPr>
         <w:pStyle w:val="ListBullet"/>
+        <w:spacing w:before="0" w:after="80"/>
       </w:pPr>
       <w:r>
         <w:rPr>
           <w:b/>
-          <w:color w:val="1A5376"/>
           <w:sz w:val="22"/>
         </w:rPr>
-        <w:t xml:space="preserve">Ärzte pro Bett:  </w:t>
+        <w:t xml:space="preserve">Ärzte pro Bett: </w:t>
       </w:r>
       <w:r>
         <w:rPr>
@@ -300,14 +256,14 @@
     <w:p>
       <w:pPr>
         <w:pStyle w:val="ListBullet"/>
+        <w:spacing w:before="0" w:after="80"/>
       </w:pPr>
       <w:r>
         <w:rPr>
           <w:b/>
-          <w:color w:val="1A5376"/>
           <w:sz w:val="22"/>
         </w:rPr>
-        <w:t xml:space="preserve">Streudiagramm:  </w:t>
+        <w:t xml:space="preserve">Streudiagramm: </w:t>
       </w:r>
       <w:r>
         <w:rPr>
@@ -319,14 +275,14 @@
     <w:p>
       <w:pPr>
         <w:pStyle w:val="ListBullet"/>
+        <w:spacing w:before="0" w:after="80"/>
       </w:pPr>
       <w:r>
         <w:rPr>
           <w:b/>
-          <w:color w:val="1A5376"/>
           <w:sz w:val="22"/>
         </w:rPr>
-        <w:t xml:space="preserve">Pivot-Tabelle:  </w:t>
+        <w:t xml:space="preserve">Pivot-Tabelle: </w:t>
       </w:r>
       <w:r>
         <w:rPr>
@@ -335,99 +291,52 @@
         <w:t>Trägerschaft × Uni-Status — wie interagieren diese zwei Merkmale?</w:t>
       </w:r>
     </w:p>
-    <w:p/>
     <w:p>
       <w:pPr>
-        <w:jc w:val="center"/>
+        <w:spacing w:before="80" w:after="80"/>
+        <w:pBdr>
+          <w:bottom w:val="single" w:sz="4" w:space="1" w:color="CCCCCC"/>
+        </w:pBdr>
+      </w:pPr>
+    </w:p>
+    <w:p>
+      <w:pPr>
+        <w:pStyle w:val="Heading1"/>
+        <w:spacing w:before="280" w:after="80"/>
       </w:pPr>
       <w:r>
-        <w:drawing>
-          <wp:inline xmlns:a="http://schemas.openxmlformats.org/drawingml/2006/main" xmlns:pic="http://schemas.openxmlformats.org/drawingml/2006/picture">
-            <wp:extent cx="5486400" cy="3086100"/>
-            <wp:docPr id="2" name="Picture 2"/>
-            <wp:cNvGraphicFramePr>
-              <a:graphicFrameLocks noChangeAspect="1"/>
-            </wp:cNvGraphicFramePr>
-            <a:graphic>
-              <a:graphicData uri="http://schemas.openxmlformats.org/drawingml/2006/picture">
-                <pic:pic>
-                  <pic:nvPicPr>
-                    <pic:cNvPr id="0" name="einflussfaktoren.png"/>
-                    <pic:cNvPicPr/>
-                  </pic:nvPicPr>
-                  <pic:blipFill>
-                    <a:blip r:embed="rId10"/>
-                    <a:stretch>
-                      <a:fillRect/>
-                    </a:stretch>
-                  </pic:blipFill>
-                  <pic:spPr>
-                    <a:xfrm>
-                      <a:off x="0" y="0"/>
-                      <a:ext cx="5486400" cy="3086100"/>
-                    </a:xfrm>
-                    <a:prstGeom prst="rect"/>
-                  </pic:spPr>
-                </pic:pic>
-              </a:graphicData>
-            </a:graphic>
-          </wp:inline>
-        </w:drawing>
-      </w:r>
-    </w:p>
-    <w:p/>
-    <w:p>
-      <w:r>
-        <w:br w:type="page"/>
+        <w:rPr>
+          <w:b/>
+          <w:color w:val="1F497D"/>
+          <w:sz w:val="28"/>
+        </w:rPr>
+        <w:t>Seite 3 — Häuser vergleichen</w:t>
       </w:r>
     </w:p>
     <w:p>
       <w:pPr>
-        <w:spacing w:before="80" w:after="40"/>
-        <w:shd w:val="clear" w:color="auto" w:fill="1A5376"/>
+        <w:spacing w:before="0" w:after="120"/>
       </w:pPr>
       <w:r>
         <w:rPr>
-          <w:b/>
-          <w:color w:val="FFFFFF"/>
-          <w:sz w:val="26"/>
-        </w:rPr>
-        <w:t xml:space="preserve">  Seite 3 — Häuser vergleichen  </w:t>
-      </w:r>
-    </w:p>
-    <w:p>
-      <w:pPr>
-        <w:spacing w:before="0"/>
-      </w:pPr>
-      <w:r>
-        <w:rPr>
-          <w:i/>
-          <w:sz w:val="21"/>
-        </w:rPr>
-        <w:t>Konkrete Krankenhäuser suchen und analysieren</w:t>
-      </w:r>
-    </w:p>
-    <w:p/>
-    <w:p>
-      <w:r>
-        <w:rPr>
           <w:b w:val="0"/>
+          <w:i w:val="0"/>
           <w:sz w:val="22"/>
         </w:rPr>
-        <w:t>Diese Seite hat zwei unabhängige Werkzeuge:</w:t>
+        <w:t>Konkrete Krankenhäuser suchen und analysieren. Diese Seite hat zwei unabhängige Werkzeuge:</w:t>
       </w:r>
     </w:p>
     <w:p>
       <w:pPr>
         <w:pStyle w:val="ListBullet"/>
+        <w:spacing w:before="0" w:after="80"/>
       </w:pPr>
       <w:r>
         <w:rPr>
           <w:b/>
-          <w:color w:val="1A5376"/>
           <w:sz w:val="22"/>
         </w:rPr>
-        <w:t xml:space="preserve">Ähnliche Häuser suchen:  </w:t>
+        <w:t xml:space="preserve">Ähnliche Häuser suchen: </w:t>
       </w:r>
       <w:r>
         <w:rPr>
@@ -439,215 +348,131 @@
     <w:p>
       <w:pPr>
         <w:pStyle w:val="ListBullet"/>
+        <w:spacing w:before="0" w:after="80"/>
       </w:pPr>
       <w:r>
         <w:rPr>
           <w:b/>
-          <w:color w:val="1A5376"/>
           <w:sz w:val="22"/>
         </w:rPr>
-        <w:t xml:space="preserve">Einzelhaus-Steckbrief:  </w:t>
+        <w:t xml:space="preserve">Einzelhaus-Steckbrief: </w:t>
       </w:r>
       <w:r>
         <w:rPr>
           <w:sz w:val="22"/>
         </w:rPr>
-        <w:t>Jedes der 1.824 Krankenhäuser einzeln auswählen und alle Kennzahlen auf einen Blick sehen — inkl. Abstand zum Gesamtmedian (z. B. „17 % über Median" in rot oder „5 % unter Median" in grün).</w:t>
-      </w:r>
-    </w:p>
-    <w:p/>
-    <w:p>
-      <w:pPr>
-        <w:jc w:val="center"/>
-      </w:pPr>
-      <w:r>
-        <w:drawing>
-          <wp:inline xmlns:a="http://schemas.openxmlformats.org/drawingml/2006/main" xmlns:pic="http://schemas.openxmlformats.org/drawingml/2006/picture">
-            <wp:extent cx="5486400" cy="3086100"/>
-            <wp:docPr id="3" name="Picture 3"/>
-            <wp:cNvGraphicFramePr>
-              <a:graphicFrameLocks noChangeAspect="1"/>
-            </wp:cNvGraphicFramePr>
-            <a:graphic>
-              <a:graphicData uri="http://schemas.openxmlformats.org/drawingml/2006/picture">
-                <pic:pic>
-                  <pic:nvPicPr>
-                    <pic:cNvPr id="0" name="haeuser_vergleichen.png"/>
-                    <pic:cNvPicPr/>
-                  </pic:nvPicPr>
-                  <pic:blipFill>
-                    <a:blip r:embed="rId11"/>
-                    <a:stretch>
-                      <a:fillRect/>
-                    </a:stretch>
-                  </pic:blipFill>
-                  <pic:spPr>
-                    <a:xfrm>
-                      <a:off x="0" y="0"/>
-                      <a:ext cx="5486400" cy="3086100"/>
-                    </a:xfrm>
-                    <a:prstGeom prst="rect"/>
-                  </pic:spPr>
-                </pic:pic>
-              </a:graphicData>
-            </a:graphic>
-          </wp:inline>
-        </w:drawing>
-      </w:r>
-    </w:p>
-    <w:p/>
-    <w:p>
-      <w:r>
-        <w:br w:type="page"/>
+        <w:t>Jedes der 1.821 Krankenhäuser einzeln auswählen und alle Kennzahlen auf einen Blick sehen — inkl. Abstand zum Gesamtmedian (z. B. „17 % über Median“ in rot oder „5 % unter Median“ in grün).</w:t>
       </w:r>
     </w:p>
     <w:p>
       <w:pPr>
-        <w:spacing w:before="80" w:after="40"/>
-        <w:shd w:val="clear" w:color="auto" w:fill="1A5376"/>
+        <w:spacing w:before="80" w:after="80"/>
+        <w:pBdr>
+          <w:bottom w:val="single" w:sz="4" w:space="1" w:color="CCCCCC"/>
+        </w:pBdr>
+      </w:pPr>
+    </w:p>
+    <w:p>
+      <w:pPr>
+        <w:pStyle w:val="Heading1"/>
+        <w:spacing w:before="280" w:after="80"/>
       </w:pPr>
       <w:r>
         <w:rPr>
           <w:b/>
-          <w:color w:val="FFFFFF"/>
-          <w:sz w:val="26"/>
+          <w:color w:val="1F497D"/>
+          <w:sz w:val="28"/>
         </w:rPr>
-        <w:t xml:space="preserve">  Seite 4 — Qualitäts-Vorhersage  </w:t>
+        <w:t>Seite 4 — Qualitäts-Vorhersage</w:t>
       </w:r>
     </w:p>
     <w:p>
       <w:pPr>
-        <w:spacing w:before="0"/>
+        <w:spacing w:before="0" w:after="120"/>
       </w:pPr>
       <w:r>
         <w:rPr>
-          <w:i/>
-          <w:sz w:val="21"/>
-        </w:rPr>
-        <w:t>Das Machine-Learning-Modell direkt ausprobieren</w:t>
-      </w:r>
-    </w:p>
-    <w:p/>
-    <w:p>
-      <w:r>
-        <w:rPr>
           <w:b w:val="0"/>
+          <w:i w:val="0"/>
           <w:sz w:val="22"/>
         </w:rPr>
-        <w:t>Das trainierte Entscheidungsbaum-Modell kann für jedes fiktive oder reale Krankenhaus eine Einschätzung abgeben, ob es wahrscheinlich viele Qualitätsprobleme haben wird.</w:t>
+        <w:t>Das Machine-Learning-Modell direkt ausprobieren. Das trainierte Entscheidungsbaum-Modell kann für jedes fiktive oder reale Krankenhaus eine Einschätzung abgeben, ob es wahrscheinlich viele Qualitätsprobleme haben wird.</w:t>
       </w:r>
     </w:p>
     <w:p>
       <w:pPr>
         <w:pStyle w:val="ListBullet"/>
+        <w:spacing w:before="0" w:after="80"/>
       </w:pPr>
       <w:r>
         <w:rPr>
           <w:b/>
-          <w:color w:val="1A5376"/>
           <w:sz w:val="22"/>
         </w:rPr>
-        <w:t xml:space="preserve">Eingabe:  </w:t>
+        <w:t xml:space="preserve">Eingabe: </w:t>
       </w:r>
       <w:r>
         <w:rPr>
           <w:sz w:val="22"/>
         </w:rPr>
-        <w:t>7 Merkmale: Bettenzahl, Trägerschaft, Uni-Klinik, Konzernhaus, Fortbildungsquote, Ärzte pro Bett, Pflegekräfte pro Bett</w:t>
+        <w:t>7 Merkmale: Bettenzahl, Trägerschaft, Uni-Klinik, Konzernhaus, Fortbildungsquote, Ärzte pro Bett, Pflegekräfte pro Bett.</w:t>
       </w:r>
     </w:p>
     <w:p>
       <w:pPr>
         <w:pStyle w:val="ListBullet"/>
+        <w:spacing w:before="0" w:after="80"/>
       </w:pPr>
       <w:r>
         <w:rPr>
           <w:b/>
-          <w:color w:val="1A5376"/>
           <w:sz w:val="22"/>
         </w:rPr>
-        <w:t xml:space="preserve">Ergebnis:  </w:t>
+        <w:t xml:space="preserve">Ergebnis: </w:t>
       </w:r>
       <w:r>
         <w:rPr>
           <w:sz w:val="22"/>
         </w:rPr>
-        <w:t>Vorhersage (viele / wenige Probleme) + Wahrscheinlichkeit beider Gruppen + Erklärung, welcher Wert den Ausschlag gegeben hat</w:t>
+        <w:t>Vorhersage (viele / wenige Probleme) + Wahrscheinlichkeit beider Gruppen + Erklärung, welcher Wert den Ausschlag gegeben hat.</w:t>
       </w:r>
     </w:p>
     <w:p>
       <w:pPr>
         <w:pStyle w:val="ListBullet"/>
+        <w:spacing w:before="0" w:after="80"/>
       </w:pPr>
       <w:r>
         <w:rPr>
           <w:b/>
-          <w:color w:val="1A5376"/>
           <w:sz w:val="22"/>
         </w:rPr>
-        <w:t xml:space="preserve">Feature Importance:  </w:t>
+        <w:t xml:space="preserve">Feature Importance: </w:t>
       </w:r>
       <w:r>
         <w:rPr>
           <w:sz w:val="22"/>
         </w:rPr>
-        <w:t>Zeigt, welche Merkmale das Modell tatsächlich nutzt — Ärzte pro Bett erklärt 53,6 % aller Modellentscheidungen</w:t>
+        <w:t>Zeigt, welche Merkmale das Modell tatsächlich nutzt — Ärzte pro Bett erklärt 72,8 % aller Modellentscheidungen.</w:t>
       </w:r>
     </w:p>
-    <w:p/>
     <w:p>
+      <w:pPr>
+        <w:spacing w:before="0" w:after="120"/>
+      </w:pPr>
       <w:r>
         <w:rPr>
-          <w:b w:val="0"/>
-          <w:color w:val="D35400"/>
-          <w:sz w:val="22"/>
+          <w:b/>
+          <w:i w:val="0"/>
+          <w:color w:val="BF5A00"/>
+          <w:sz w:val="20"/>
         </w:rPr>
-        <w:t>⚠️  Hinweis: Das Modell trifft in 63,6 % der Fälle die richtige Vorhersage. Die Vorhersage ist ein Hinweis zur Orientierung — keine gesicherte Aussage.</w:t>
-      </w:r>
-    </w:p>
-    <w:p/>
-    <w:p>
-      <w:pPr>
-        <w:jc w:val="center"/>
-      </w:pPr>
-      <w:r>
-        <w:drawing>
-          <wp:inline xmlns:a="http://schemas.openxmlformats.org/drawingml/2006/main" xmlns:pic="http://schemas.openxmlformats.org/drawingml/2006/picture">
-            <wp:extent cx="5486400" cy="3086100"/>
-            <wp:docPr id="4" name="Picture 4"/>
-            <wp:cNvGraphicFramePr>
-              <a:graphicFrameLocks noChangeAspect="1"/>
-            </wp:cNvGraphicFramePr>
-            <a:graphic>
-              <a:graphicData uri="http://schemas.openxmlformats.org/drawingml/2006/picture">
-                <pic:pic>
-                  <pic:nvPicPr>
-                    <pic:cNvPr id="0" name="qualitaets_vorhersage.png"/>
-                    <pic:cNvPicPr/>
-                  </pic:nvPicPr>
-                  <pic:blipFill>
-                    <a:blip r:embed="rId12"/>
-                    <a:stretch>
-                      <a:fillRect/>
-                    </a:stretch>
-                  </pic:blipFill>
-                  <pic:spPr>
-                    <a:xfrm>
-                      <a:off x="0" y="0"/>
-                      <a:ext cx="5486400" cy="3086100"/>
-                    </a:xfrm>
-                    <a:prstGeom prst="rect"/>
-                  </pic:spPr>
-                </pic:pic>
-              </a:graphicData>
-            </a:graphic>
-          </wp:inline>
-        </w:drawing>
+        <w:t>⚠️  Hinweis: Das Modell trifft in 57,0 % der Fälle die richtige Vorhersage. Die Vorhersage ist ein Hinweis zur Orientierung — keine gesicherte Aussage.</w:t>
       </w:r>
     </w:p>
     <w:sectPr>
       <w:pgSz w:w="12240" w:h="15840"/>
-      <w:pgMar w:top="1134" w:right="1134" w:bottom="1134" w:left="1417" w:header="720" w:footer="720" w:gutter="0"/>
+      <w:pgMar w:top="1417" w:right="1417" w:bottom="1134" w:left="1701" w:header="720" w:footer="720" w:gutter="0"/>
       <w:cols w:space="720"/>
       <w:docGrid w:linePitch="360"/>
     </w:sectPr>

</xml_diff>